<commit_message>
slight fixes for lab2
</commit_message>
<xml_diff>
--- a/Lab2_Vkladeni_cykly_DP.docx
+++ b/Lab2_Vkladeni_cykly_DP.docx
@@ -1305,7 +1305,7 @@
         <w:t xml:space="preserve"> </w:t>
       </w:r>
       <w:r>
-        <w:t>— біноміальний коефіцієнт n!/(i!(n−i)!). Два записи потребують окремого зауваження щодо друку в джерелі — позначено виносками нижче (варіанти 15 та 18).</w:t>
+        <w:t>— біноміальний коефіцієнт n!/(i!(n−i)!).</w:t>
       </w:r>
     </w:p>
     <w:p>
@@ -1329,7 +1329,7 @@
         </w:numPr>
       </w:pPr>
       <w:r>
-        <w:t>P = cos x = 0.5 · Π(i=−n..n) { [2x − Σ(j=1..i) π] / [x + Σ(j=1..i) π] }</w:t>
+        <w:t xml:space="preserve">P = cos x = 0.5 · Π(i=−n..n) { [2x − sgn(i) · Σ(j=1..|i|) π] / [x + sgn(i) · Σ(j=1..|i|) π] }</w:t>
       </w:r>
     </w:p>
     <w:p>
@@ -1425,7 +1425,7 @@
         </w:numPr>
       </w:pPr>
       <w:r>
-        <w:t>P = cos x = Π(i=1..n) {1 − 4x² / [π²·Σ(j=1..i)(2j−1)]} (x = 1/3)</w:t>
+        <w:t xml:space="preserve">P = cos x = Π(i=1..n) {1 − 4x² / [π²·Σ(j=1..i)(4j−1)]} (x = 1/3)</w:t>
       </w:r>
     </w:p>
     <w:p>
@@ -1473,7 +1473,7 @@
         </w:numPr>
       </w:pPr>
       <w:r>
-        <w:t>P = sin(x)/x = Π(i=0..n) {1 − x² / [π²·Σ(j=1..i)(2j−1)]} (x = 1/3)</w:t>
+        <w:t xml:space="preserve">P = sin(x)/x = Π(i=1..n) {1 − x² / [π²·Σ(j=1..i)(2j−1)]} (x = 1/3)</w:t>
       </w:r>
     </w:p>
     <w:p>
@@ -1485,59 +1485,7 @@
         </w:numPr>
       </w:pPr>
       <w:r>
-        <w:t xml:space="preserve">S = 1/(1+x) = Σ(i=0..n) (−1)^i · x^i (x = 1/3) — </w:t>
-      </w:r>
-      <w:r>
-        <w:rPr>
-          <w:i/>
-          <w:iCs/>
-        </w:rPr>
-        <w:t xml:space="preserve">у джерелі між </w:t>
-      </w:r>
-      <w:r>
-        <w:rPr>
-          <w:rStyle w:val="VerbatimChar"/>
-          <w:i/>
-          <w:iCs/>
-        </w:rPr>
-        <w:t>(−1)^i</w:t>
-      </w:r>
-      <w:r>
-        <w:rPr>
-          <w:i/>
-          <w:iCs/>
-        </w:rPr>
-        <w:t xml:space="preserve"> та </w:t>
-      </w:r>
-      <w:r>
-        <w:rPr>
-          <w:rStyle w:val="VerbatimChar"/>
-          <w:i/>
-          <w:iCs/>
-        </w:rPr>
-        <w:t>x^i</w:t>
-      </w:r>
-      <w:r>
-        <w:rPr>
-          <w:i/>
-          <w:iCs/>
-        </w:rPr>
-        <w:t xml:space="preserve"> надруковано крапку з комою; за змістом (це ряд геометричної прогресії) це знак множення, тож тут відтворено як </w:t>
-      </w:r>
-      <w:r>
-        <w:rPr>
-          <w:rStyle w:val="VerbatimChar"/>
-          <w:i/>
-          <w:iCs/>
-        </w:rPr>
-        <w:t>(−1)^i · x^i</w:t>
-      </w:r>
-      <w:r>
-        <w:rPr>
-          <w:i/>
-          <w:iCs/>
-        </w:rPr>
-        <w:t>.</w:t>
+        <w:t xml:space="preserve">S = 1/(1+x) = Σ(i=0..n) (−1)^i · x^i (x = 1/3)</w:t>
       </w:r>
     </w:p>
     <w:p>
@@ -1573,14 +1521,7 @@
         </w:numPr>
       </w:pPr>
       <w:r>
-        <w:t xml:space="preserve">P = cos x − sin x = Π(i=1..n) {1 + [(−1)^i · 4x] / [(2i−1) · Σ(j=1..i) π]} (x = 0.5) — </w:t>
-      </w:r>
-      <w:r>
-        <w:rPr>
-          <w:i/>
-          <w:iCs/>
-        </w:rPr>
-        <w:t>у джерелі верхня межа внутрішньої суми Σπ надрукована нечітко (не видно показника степеня над Σ, на відміну від аналогічних формул). Тут прийнято за аналогією з рештою варіантів, що це Σ(j=1..i); за потреби звірте з оригіналом.</w:t>
+        <w:t xml:space="preserve">P = cos x − sin x = Π(i=1..n) {1 + [(−1)^i · 4x] / [(2i−1) · Σ(j=1..2i−1) π]} (x = 0.5)</w:t>
       </w:r>
     </w:p>
     <w:p>
@@ -1736,7 +1677,7 @@
         </w:numPr>
       </w:pPr>
       <w:r>
-        <w:t>P = sin(3x)/sin x = −Π(i=−n..n) {1 − 4x² / [x² + 2xiπ + π²·Σ(j=1..i)(2j−1)]} (x = 1/3)</w:t>
+        <w:t xml:space="preserve">P = sin(3x)/sin x = −Π(i=−n..n) {1 − 4x² / [x² + 2xiπ + π²·Σ(j=1..|i|)(2j−1)]} (x = 1/3)</w:t>
       </w:r>
     </w:p>
     <w:p>

</xml_diff>

<commit_message>
additional fixes to lab2
</commit_message>
<xml_diff>
--- a/Lab2_Vkladeni_cykly_DP.docx
+++ b/Lab2_Vkladeni_cykly_DP.docx
@@ -1521,7 +1521,7 @@
         </w:numPr>
       </w:pPr>
       <w:r>
-        <w:t xml:space="preserve">P = cos x − sin x = Π(i=1..n) {1 + [(−1)^i · 4x] / [(2i−1) · Σ(j=1..2i−1) π]} (x = 0.5)</w:t>
+        <w:t xml:space="preserve">P = cos x − sin x = Π(i=1..n) {1 + [(−1)^i · 4x] / [Σ(j=1..2i−1) π]} (x = 0.5)</w:t>
       </w:r>
     </w:p>
     <w:p>
@@ -1617,7 +1617,7 @@
         </w:numPr>
       </w:pPr>
       <w:r>
-        <w:t>P = cos²x = [(π+2x)²/4] · Π(i=1..n) {1 − (π+2x)² / [4π²·Σ(j=1..i)(2j−1)]} (x = 1/3)</w:t>
+        <w:t>P = cos²x = [(π+2x)²/4] · ( Π(i=1..n) {1 − (π+2x)² / [4π²·Σ(j=1..i)(2j−1)]} )² (x = 1/3)</w:t>
       </w:r>
     </w:p>
     <w:p>

</xml_diff>